<commit_message>
meeting notes july 9th
</commit_message>
<xml_diff>
--- a/meeting_notes/MeetingNotes_09July.docx
+++ b/meeting_notes/MeetingNotes_09July.docx
@@ -122,9 +122,6 @@
       <w:r>
         <w:t>, and RMSE</w:t>
       </w:r>
-      <w:r>
-        <w:t xml:space="preserve"> – should have </w:t>
-      </w:r>
     </w:p>
     <w:p>
       <w:pPr>
@@ -233,7 +230,7 @@
           <w:noProof/>
         </w:rPr>
         <w:drawing>
-          <wp:inline distT="0" distB="0" distL="0" distR="0" wp14:anchorId="7A9EC0D6" wp14:editId="60C105B3">
+          <wp:inline distT="0" distB="0" distL="0" distR="0" wp14:anchorId="7A9EC0D6" wp14:editId="429162AB">
             <wp:extent cx="5731510" cy="1692910"/>
             <wp:effectExtent l="0" t="0" r="0" b="0"/>
             <wp:docPr id="1484074297" name="Picture 1"/>

</xml_diff>